<commit_message>
Add TC-BOOKING-010 for CI verification
</commit_message>
<xml_diff>
--- a/Selenium_WebDriver/reports/Appointment_Test_Report.docx
+++ b/Selenium_WebDriver/reports/Appointment_Test_Report.docx
@@ -28,7 +28,7 @@
           <w:color w:val="000000"/>
           <w:sz w:val="26"/>
         </w:rPr>
-        <w:t>Thời gian tạo báo cáo: 07/09/2026 19:12:19</w:t>
+        <w:t>Thời gian tạo báo cáo: 14/09/2026 19:39:35</w:t>
       </w:r>
     </w:p>
     <w:p/>
@@ -410,22 +410,22 @@
                 <w:color w:val="000000"/>
                 <w:sz w:val="26"/>
               </w:rPr>
-              <w:t>07/09/2026 18:52:46</w:t>
-            </w:r>
-          </w:p>
-        </w:tc>
-        <w:tc>
-          <w:tcPr>
-            <w:tcW w:type="dxa" w:w="1440"/>
-          </w:tcPr>
-          <w:p>
-            <w:r>
-              <w:rPr>
-                <w:rFonts w:ascii="Times New Roman" w:hAnsi="Times New Roman" w:eastAsia="Times New Roman"/>
-                <w:color w:val="000000"/>
-                <w:sz w:val="26"/>
-              </w:rPr>
-              <w:t>7.73</w:t>
+              <w:t>14/09/2026 19:19:21</w:t>
+            </w:r>
+          </w:p>
+        </w:tc>
+        <w:tc>
+          <w:tcPr>
+            <w:tcW w:type="dxa" w:w="1440"/>
+          </w:tcPr>
+          <w:p>
+            <w:r>
+              <w:rPr>
+                <w:rFonts w:ascii="Times New Roman" w:hAnsi="Times New Roman" w:eastAsia="Times New Roman"/>
+                <w:color w:val="000000"/>
+                <w:sz w:val="26"/>
+              </w:rPr>
+              <w:t>7.70</w:t>
             </w:r>
           </w:p>
         </w:tc>
@@ -500,22 +500,22 @@
                 <w:color w:val="000000"/>
                 <w:sz w:val="26"/>
               </w:rPr>
-              <w:t>07/09/2026 18:52:58</w:t>
-            </w:r>
-          </w:p>
-        </w:tc>
-        <w:tc>
-          <w:tcPr>
-            <w:tcW w:type="dxa" w:w="1440"/>
-          </w:tcPr>
-          <w:p>
-            <w:r>
-              <w:rPr>
-                <w:rFonts w:ascii="Times New Roman" w:hAnsi="Times New Roman" w:eastAsia="Times New Roman"/>
-                <w:color w:val="000000"/>
-                <w:sz w:val="26"/>
-              </w:rPr>
-              <w:t>8.48</w:t>
+              <w:t>14/09/2026 19:19:33</w:t>
+            </w:r>
+          </w:p>
+        </w:tc>
+        <w:tc>
+          <w:tcPr>
+            <w:tcW w:type="dxa" w:w="1440"/>
+          </w:tcPr>
+          <w:p>
+            <w:r>
+              <w:rPr>
+                <w:rFonts w:ascii="Times New Roman" w:hAnsi="Times New Roman" w:eastAsia="Times New Roman"/>
+                <w:color w:val="000000"/>
+                <w:sz w:val="26"/>
+              </w:rPr>
+              <w:t>8.54</w:t>
             </w:r>
           </w:p>
         </w:tc>
@@ -590,22 +590,22 @@
                 <w:color w:val="000000"/>
                 <w:sz w:val="26"/>
               </w:rPr>
-              <w:t>07/09/2026 18:53:10</w:t>
-            </w:r>
-          </w:p>
-        </w:tc>
-        <w:tc>
-          <w:tcPr>
-            <w:tcW w:type="dxa" w:w="1440"/>
-          </w:tcPr>
-          <w:p>
-            <w:r>
-              <w:rPr>
-                <w:rFonts w:ascii="Times New Roman" w:hAnsi="Times New Roman" w:eastAsia="Times New Roman"/>
-                <w:color w:val="000000"/>
-                <w:sz w:val="26"/>
-              </w:rPr>
-              <w:t>8.51</w:t>
+              <w:t>14/09/2026 19:19:45</w:t>
+            </w:r>
+          </w:p>
+        </w:tc>
+        <w:tc>
+          <w:tcPr>
+            <w:tcW w:type="dxa" w:w="1440"/>
+          </w:tcPr>
+          <w:p>
+            <w:r>
+              <w:rPr>
+                <w:rFonts w:ascii="Times New Roman" w:hAnsi="Times New Roman" w:eastAsia="Times New Roman"/>
+                <w:color w:val="000000"/>
+                <w:sz w:val="26"/>
+              </w:rPr>
+              <w:t>8.69</w:t>
             </w:r>
           </w:p>
         </w:tc>
@@ -680,22 +680,22 @@
                 <w:color w:val="000000"/>
                 <w:sz w:val="26"/>
               </w:rPr>
-              <w:t>07/09/2026 18:53:30</w:t>
-            </w:r>
-          </w:p>
-        </w:tc>
-        <w:tc>
-          <w:tcPr>
-            <w:tcW w:type="dxa" w:w="1440"/>
-          </w:tcPr>
-          <w:p>
-            <w:r>
-              <w:rPr>
-                <w:rFonts w:ascii="Times New Roman" w:hAnsi="Times New Roman" w:eastAsia="Times New Roman"/>
-                <w:color w:val="000000"/>
-                <w:sz w:val="26"/>
-              </w:rPr>
-              <w:t>7.92</w:t>
+              <w:t>14/09/2026 19:20:05</w:t>
+            </w:r>
+          </w:p>
+        </w:tc>
+        <w:tc>
+          <w:tcPr>
+            <w:tcW w:type="dxa" w:w="1440"/>
+          </w:tcPr>
+          <w:p>
+            <w:r>
+              <w:rPr>
+                <w:rFonts w:ascii="Times New Roman" w:hAnsi="Times New Roman" w:eastAsia="Times New Roman"/>
+                <w:color w:val="000000"/>
+                <w:sz w:val="26"/>
+              </w:rPr>
+              <w:t>7.84</w:t>
             </w:r>
           </w:p>
         </w:tc>
@@ -771,7 +771,7 @@
                 <w:color w:val="000000"/>
                 <w:sz w:val="26"/>
               </w:rPr>
-              <w:t>07/09/2026 18:53:42</w:t>
+              <w:t>14/09/2026 19:20:17</w:t>
             </w:r>
           </w:p>
         </w:tc>
@@ -861,22 +861,22 @@
                 <w:color w:val="000000"/>
                 <w:sz w:val="26"/>
               </w:rPr>
-              <w:t>07/09/2026 18:53:47</w:t>
-            </w:r>
-          </w:p>
-        </w:tc>
-        <w:tc>
-          <w:tcPr>
-            <w:tcW w:type="dxa" w:w="1440"/>
-          </w:tcPr>
-          <w:p>
-            <w:r>
-              <w:rPr>
-                <w:rFonts w:ascii="Times New Roman" w:hAnsi="Times New Roman" w:eastAsia="Times New Roman"/>
-                <w:color w:val="000000"/>
-                <w:sz w:val="26"/>
-              </w:rPr>
-              <w:t>1.90</w:t>
+              <w:t>14/09/2026 19:20:22</w:t>
+            </w:r>
+          </w:p>
+        </w:tc>
+        <w:tc>
+          <w:tcPr>
+            <w:tcW w:type="dxa" w:w="1440"/>
+          </w:tcPr>
+          <w:p>
+            <w:r>
+              <w:rPr>
+                <w:rFonts w:ascii="Times New Roman" w:hAnsi="Times New Roman" w:eastAsia="Times New Roman"/>
+                <w:color w:val="000000"/>
+                <w:sz w:val="26"/>
+              </w:rPr>
+              <w:t>1.93</w:t>
             </w:r>
           </w:p>
         </w:tc>
@@ -951,22 +951,22 @@
                 <w:color w:val="000000"/>
                 <w:sz w:val="26"/>
               </w:rPr>
-              <w:t>07/09/2026 18:54:01</w:t>
-            </w:r>
-          </w:p>
-        </w:tc>
-        <w:tc>
-          <w:tcPr>
-            <w:tcW w:type="dxa" w:w="1440"/>
-          </w:tcPr>
-          <w:p>
-            <w:r>
-              <w:rPr>
-                <w:rFonts w:ascii="Times New Roman" w:hAnsi="Times New Roman" w:eastAsia="Times New Roman"/>
-                <w:color w:val="000000"/>
-                <w:sz w:val="26"/>
-              </w:rPr>
-              <w:t>10.98</w:t>
+              <w:t>14/09/2026 19:20:36</w:t>
+            </w:r>
+          </w:p>
+        </w:tc>
+        <w:tc>
+          <w:tcPr>
+            <w:tcW w:type="dxa" w:w="1440"/>
+          </w:tcPr>
+          <w:p>
+            <w:r>
+              <w:rPr>
+                <w:rFonts w:ascii="Times New Roman" w:hAnsi="Times New Roman" w:eastAsia="Times New Roman"/>
+                <w:color w:val="000000"/>
+                <w:sz w:val="26"/>
+              </w:rPr>
+              <w:t>10.96</w:t>
             </w:r>
           </w:p>
         </w:tc>
@@ -1041,22 +1041,22 @@
                 <w:color w:val="000000"/>
                 <w:sz w:val="26"/>
               </w:rPr>
-              <w:t>07/09/2026 18:54:15</w:t>
-            </w:r>
-          </w:p>
-        </w:tc>
-        <w:tc>
-          <w:tcPr>
-            <w:tcW w:type="dxa" w:w="1440"/>
-          </w:tcPr>
-          <w:p>
-            <w:r>
-              <w:rPr>
-                <w:rFonts w:ascii="Times New Roman" w:hAnsi="Times New Roman" w:eastAsia="Times New Roman"/>
-                <w:color w:val="000000"/>
-                <w:sz w:val="26"/>
-              </w:rPr>
-              <w:t>11.16</w:t>
+              <w:t>14/09/2026 19:20:50</w:t>
+            </w:r>
+          </w:p>
+        </w:tc>
+        <w:tc>
+          <w:tcPr>
+            <w:tcW w:type="dxa" w:w="1440"/>
+          </w:tcPr>
+          <w:p>
+            <w:r>
+              <w:rPr>
+                <w:rFonts w:ascii="Times New Roman" w:hAnsi="Times New Roman" w:eastAsia="Times New Roman"/>
+                <w:color w:val="000000"/>
+                <w:sz w:val="26"/>
+              </w:rPr>
+              <w:t>11.10</w:t>
             </w:r>
           </w:p>
         </w:tc>
@@ -1131,22 +1131,22 @@
                 <w:color w:val="000000"/>
                 <w:sz w:val="26"/>
               </w:rPr>
-              <w:t>07/09/2026 18:53:19</w:t>
-            </w:r>
-          </w:p>
-        </w:tc>
-        <w:tc>
-          <w:tcPr>
-            <w:tcW w:type="dxa" w:w="1440"/>
-          </w:tcPr>
-          <w:p>
-            <w:r>
-              <w:rPr>
-                <w:rFonts w:ascii="Times New Roman" w:hAnsi="Times New Roman" w:eastAsia="Times New Roman"/>
-                <w:color w:val="000000"/>
-                <w:sz w:val="26"/>
-              </w:rPr>
-              <w:t>5.70</w:t>
+              <w:t>14/09/2026 19:19:54</w:t>
+            </w:r>
+          </w:p>
+        </w:tc>
+        <w:tc>
+          <w:tcPr>
+            <w:tcW w:type="dxa" w:w="1440"/>
+          </w:tcPr>
+          <w:p>
+            <w:r>
+              <w:rPr>
+                <w:rFonts w:ascii="Times New Roman" w:hAnsi="Times New Roman" w:eastAsia="Times New Roman"/>
+                <w:color w:val="000000"/>
+                <w:sz w:val="26"/>
+              </w:rPr>
+              <w:t>5.78</w:t>
             </w:r>
           </w:p>
         </w:tc>
@@ -1357,7 +1357,7 @@
                 <w:color w:val="000000"/>
                 <w:sz w:val="26"/>
               </w:rPr>
-              <w:t>07/09/2026 18:52:43</w:t>
+              <w:t>14/09/2026 19:19:18</w:t>
             </w:r>
           </w:p>
         </w:tc>
@@ -1448,22 +1448,22 @@
                 <w:color w:val="000000"/>
                 <w:sz w:val="26"/>
               </w:rPr>
-              <w:t>07/09/2026 18:52:44</w:t>
-            </w:r>
-          </w:p>
-        </w:tc>
-        <w:tc>
-          <w:tcPr>
-            <w:tcW w:type="dxa" w:w="1440"/>
-          </w:tcPr>
-          <w:p>
-            <w:r>
-              <w:rPr>
-                <w:rFonts w:ascii="Times New Roman" w:hAnsi="Times New Roman" w:eastAsia="Times New Roman"/>
-                <w:color w:val="000000"/>
-                <w:sz w:val="26"/>
-              </w:rPr>
-              <w:t>Chọn ngày 19/09/2026, giờ 08:00 và nhập ghi chú</w:t>
+              <w:t>14/09/2026 19:19:18</w:t>
+            </w:r>
+          </w:p>
+        </w:tc>
+        <w:tc>
+          <w:tcPr>
+            <w:tcW w:type="dxa" w:w="1440"/>
+          </w:tcPr>
+          <w:p>
+            <w:r>
+              <w:rPr>
+                <w:rFonts w:ascii="Times New Roman" w:hAnsi="Times New Roman" w:eastAsia="Times New Roman"/>
+                <w:color w:val="000000"/>
+                <w:sz w:val="26"/>
+              </w:rPr>
+              <w:t>Chọn ngày 19/09/2026, giờ 09:30 và nhập ghi chú</w:t>
             </w:r>
           </w:p>
         </w:tc>
@@ -1539,7 +1539,7 @@
                 <w:color w:val="000000"/>
                 <w:sz w:val="26"/>
               </w:rPr>
-              <w:t>07/09/2026 18:52:44</w:t>
+              <w:t>14/09/2026 19:19:18</w:t>
             </w:r>
           </w:p>
         </w:tc>
@@ -1631,7 +1631,7 @@
                 <w:color w:val="000000"/>
                 <w:sz w:val="26"/>
               </w:rPr>
-              <w:t>07/09/2026 18:52:45</w:t>
+              <w:t>14/09/2026 19:19:20</w:t>
             </w:r>
           </w:p>
         </w:tc>
@@ -1722,7 +1722,7 @@
                 <w:color w:val="000000"/>
                 <w:sz w:val="26"/>
               </w:rPr>
-              <w:t>07/09/2026 18:52:46</w:t>
+              <w:t>14/09/2026 19:19:21</w:t>
             </w:r>
           </w:p>
         </w:tc>
@@ -1813,7 +1813,7 @@
                 <w:color w:val="000000"/>
                 <w:sz w:val="26"/>
               </w:rPr>
-              <w:t>07/09/2026 18:52:46</w:t>
+              <w:t>14/09/2026 19:19:21</w:t>
             </w:r>
           </w:p>
         </w:tc>
@@ -1904,7 +1904,7 @@
                 <w:color w:val="000000"/>
                 <w:sz w:val="26"/>
               </w:rPr>
-              <w:t>07/09/2026 18:52:51</w:t>
+              <w:t>14/09/2026 19:19:26</w:t>
             </w:r>
           </w:p>
         </w:tc>
@@ -1995,7 +1995,7 @@
                 <w:color w:val="000000"/>
                 <w:sz w:val="26"/>
               </w:rPr>
-              <w:t>07/09/2026 18:52:51</w:t>
+              <w:t>14/09/2026 19:19:26</w:t>
             </w:r>
           </w:p>
         </w:tc>
@@ -2086,7 +2086,7 @@
                 <w:color w:val="000000"/>
                 <w:sz w:val="26"/>
               </w:rPr>
-              <w:t>07/09/2026 18:52:52</w:t>
+              <w:t>14/09/2026 19:19:27</w:t>
             </w:r>
           </w:p>
         </w:tc>
@@ -2177,7 +2177,7 @@
                 <w:color w:val="000000"/>
                 <w:sz w:val="26"/>
               </w:rPr>
-              <w:t>07/09/2026 18:52:52</w:t>
+              <w:t>14/09/2026 19:19:27</w:t>
             </w:r>
           </w:p>
         </w:tc>
@@ -2269,7 +2269,7 @@
                 <w:color w:val="000000"/>
                 <w:sz w:val="26"/>
               </w:rPr>
-              <w:t>07/09/2026 18:52:58</w:t>
+              <w:t>14/09/2026 19:19:33</w:t>
             </w:r>
           </w:p>
         </w:tc>
@@ -2360,7 +2360,7 @@
                 <w:color w:val="000000"/>
                 <w:sz w:val="26"/>
               </w:rPr>
-              <w:t>07/09/2026 18:53:03</w:t>
+              <w:t>14/09/2026 19:19:38</w:t>
             </w:r>
           </w:p>
         </w:tc>
@@ -2451,7 +2451,7 @@
                 <w:color w:val="000000"/>
                 <w:sz w:val="26"/>
               </w:rPr>
-              <w:t>07/09/2026 18:53:03</w:t>
+              <w:t>14/09/2026 19:19:38</w:t>
             </w:r>
           </w:p>
         </w:tc>
@@ -2542,7 +2542,7 @@
                 <w:color w:val="000000"/>
                 <w:sz w:val="26"/>
               </w:rPr>
-              <w:t>07/09/2026 18:53:03</w:t>
+              <w:t>14/09/2026 19:19:38</w:t>
             </w:r>
           </w:p>
         </w:tc>
@@ -2633,7 +2633,7 @@
                 <w:color w:val="000000"/>
                 <w:sz w:val="26"/>
               </w:rPr>
-              <w:t>07/09/2026 18:53:04</w:t>
+              <w:t>14/09/2026 19:19:39</w:t>
             </w:r>
           </w:p>
         </w:tc>
@@ -2725,7 +2725,7 @@
                 <w:color w:val="000000"/>
                 <w:sz w:val="26"/>
               </w:rPr>
-              <w:t>07/09/2026 18:53:10</w:t>
+              <w:t>14/09/2026 19:19:45</w:t>
             </w:r>
           </w:p>
         </w:tc>
@@ -2816,7 +2816,7 @@
                 <w:color w:val="000000"/>
                 <w:sz w:val="26"/>
               </w:rPr>
-              <w:t>07/09/2026 18:53:15</w:t>
+              <w:t>14/09/2026 19:19:50</w:t>
             </w:r>
           </w:p>
         </w:tc>
@@ -2907,7 +2907,7 @@
                 <w:color w:val="000000"/>
                 <w:sz w:val="26"/>
               </w:rPr>
-              <w:t>07/09/2026 18:53:15</w:t>
+              <w:t>14/09/2026 19:19:50</w:t>
             </w:r>
           </w:p>
         </w:tc>
@@ -2998,7 +2998,7 @@
                 <w:color w:val="000000"/>
                 <w:sz w:val="26"/>
               </w:rPr>
-              <w:t>07/09/2026 18:53:15</w:t>
+              <w:t>14/09/2026 19:19:50</w:t>
             </w:r>
           </w:p>
         </w:tc>
@@ -3089,7 +3089,7 @@
                 <w:color w:val="000000"/>
                 <w:sz w:val="26"/>
               </w:rPr>
-              <w:t>07/09/2026 18:53:16</w:t>
+              <w:t>14/09/2026 19:19:51</w:t>
             </w:r>
           </w:p>
         </w:tc>
@@ -3180,7 +3180,7 @@
                 <w:color w:val="000000"/>
                 <w:sz w:val="26"/>
               </w:rPr>
-              <w:t>07/09/2026 18:53:19</w:t>
+              <w:t>14/09/2026 19:19:54</w:t>
             </w:r>
           </w:p>
         </w:tc>
@@ -3271,7 +3271,7 @@
                 <w:color w:val="000000"/>
                 <w:sz w:val="26"/>
               </w:rPr>
-              <w:t>07/09/2026 18:53:19</w:t>
+              <w:t>14/09/2026 19:19:54</w:t>
             </w:r>
           </w:p>
         </w:tc>
@@ -3362,7 +3362,7 @@
                 <w:color w:val="000000"/>
                 <w:sz w:val="26"/>
               </w:rPr>
-              <w:t>07/09/2026 18:53:24</w:t>
+              <w:t>14/09/2026 19:19:59</w:t>
             </w:r>
           </w:p>
         </w:tc>
@@ -3453,7 +3453,7 @@
                 <w:color w:val="000000"/>
                 <w:sz w:val="26"/>
               </w:rPr>
-              <w:t>07/09/2026 18:53:24</w:t>
+              <w:t>14/09/2026 19:19:59</w:t>
             </w:r>
           </w:p>
         </w:tc>
@@ -3544,7 +3544,7 @@
                 <w:color w:val="000000"/>
                 <w:sz w:val="26"/>
               </w:rPr>
-              <w:t>07/09/2026 18:53:30</w:t>
+              <w:t>14/09/2026 19:20:05</w:t>
             </w:r>
           </w:p>
         </w:tc>
@@ -3580,7 +3580,7 @@
               <w:br/>
               <w:t xml:space="preserve"> +  where False = is_patient_profile_button_present(320)</w:t>
               <w:br/>
-              <w:t xml:space="preserve"> +    where is_patient_profile_button_present = &lt;pages.DoctorAppointmentPage.DoctorAppointmentPage object at 0x000001439491C890&gt;.is_patient_profile_button_present</w:t>
+              <w:t xml:space="preserve"> +    where is_patient_profile_button_present = &lt;pages.DoctorAppointmentPage.DoctorAppointmentPage object at 0x00000229A7C0D750&gt;.is_patient_profile_button_present</w:t>
             </w:r>
           </w:p>
         </w:tc>
@@ -3642,7 +3642,7 @@
                 <w:color w:val="000000"/>
                 <w:sz w:val="26"/>
               </w:rPr>
-              <w:t>07/09/2026 18:53:35</w:t>
+              <w:t>14/09/2026 19:20:10</w:t>
             </w:r>
           </w:p>
         </w:tc>
@@ -3733,7 +3733,7 @@
                 <w:color w:val="000000"/>
                 <w:sz w:val="26"/>
               </w:rPr>
-              <w:t>07/09/2026 18:53:35</w:t>
+              <w:t>14/09/2026 19:20:10</w:t>
             </w:r>
           </w:p>
         </w:tc>
@@ -3824,7 +3824,7 @@
                 <w:color w:val="000000"/>
                 <w:sz w:val="26"/>
               </w:rPr>
-              <w:t>07/09/2026 18:53:35</w:t>
+              <w:t>14/09/2026 19:20:10</w:t>
             </w:r>
           </w:p>
         </w:tc>
@@ -3915,7 +3915,7 @@
                 <w:color w:val="000000"/>
                 <w:sz w:val="26"/>
               </w:rPr>
-              <w:t>07/09/2026 18:53:41</w:t>
+              <w:t>14/09/2026 19:20:16</w:t>
             </w:r>
           </w:p>
         </w:tc>
@@ -4006,7 +4006,7 @@
                 <w:color w:val="000000"/>
                 <w:sz w:val="26"/>
               </w:rPr>
-              <w:t>07/09/2026 18:53:42</w:t>
+              <w:t>14/09/2026 19:20:17</w:t>
             </w:r>
           </w:p>
         </w:tc>
@@ -4097,7 +4097,7 @@
                 <w:color w:val="000000"/>
                 <w:sz w:val="26"/>
               </w:rPr>
-              <w:t>07/09/2026 18:53:46</w:t>
+              <w:t>14/09/2026 19:20:21</w:t>
             </w:r>
           </w:p>
         </w:tc>
@@ -4188,7 +4188,7 @@
                 <w:color w:val="000000"/>
                 <w:sz w:val="26"/>
               </w:rPr>
-              <w:t>07/09/2026 18:53:47</w:t>
+              <w:t>14/09/2026 19:20:22</w:t>
             </w:r>
           </w:p>
         </w:tc>
@@ -4279,7 +4279,7 @@
                 <w:color w:val="000000"/>
                 <w:sz w:val="26"/>
               </w:rPr>
-              <w:t>07/09/2026 18:53:47</w:t>
+              <w:t>14/09/2026 19:20:22</w:t>
             </w:r>
           </w:p>
         </w:tc>
@@ -4370,7 +4370,7 @@
                 <w:color w:val="000000"/>
                 <w:sz w:val="26"/>
               </w:rPr>
-              <w:t>07/09/2026 18:53:47</w:t>
+              <w:t>14/09/2026 19:20:22</w:t>
             </w:r>
           </w:p>
         </w:tc>
@@ -4461,7 +4461,7 @@
                 <w:color w:val="000000"/>
                 <w:sz w:val="26"/>
               </w:rPr>
-              <w:t>07/09/2026 18:53:47</w:t>
+              <w:t>14/09/2026 19:20:22</w:t>
             </w:r>
           </w:p>
         </w:tc>
@@ -4552,7 +4552,7 @@
                 <w:color w:val="000000"/>
                 <w:sz w:val="26"/>
               </w:rPr>
-              <w:t>07/09/2026 18:53:51</w:t>
+              <w:t>14/09/2026 19:20:26</w:t>
             </w:r>
           </w:p>
         </w:tc>
@@ -4643,7 +4643,7 @@
                 <w:color w:val="000000"/>
                 <w:sz w:val="26"/>
               </w:rPr>
-              <w:t>07/09/2026 18:53:55</w:t>
+              <w:t>14/09/2026 19:20:30</w:t>
             </w:r>
           </w:p>
         </w:tc>
@@ -4734,7 +4734,7 @@
                 <w:color w:val="000000"/>
                 <w:sz w:val="26"/>
               </w:rPr>
-              <w:t>07/09/2026 18:53:55</w:t>
+              <w:t>14/09/2026 19:20:30</w:t>
             </w:r>
           </w:p>
         </w:tc>
@@ -4825,7 +4825,7 @@
                 <w:color w:val="000000"/>
                 <w:sz w:val="26"/>
               </w:rPr>
-              <w:t>07/09/2026 18:53:55</w:t>
+              <w:t>14/09/2026 19:20:30</w:t>
             </w:r>
           </w:p>
         </w:tc>
@@ -4916,7 +4916,7 @@
                 <w:color w:val="000000"/>
                 <w:sz w:val="26"/>
               </w:rPr>
-              <w:t>07/09/2026 18:54:01</w:t>
+              <w:t>14/09/2026 19:20:36</w:t>
             </w:r>
           </w:p>
         </w:tc>
@@ -5007,7 +5007,7 @@
                 <w:color w:val="000000"/>
                 <w:sz w:val="26"/>
               </w:rPr>
-              <w:t>07/09/2026 18:54:06</w:t>
+              <w:t>14/09/2026 19:20:41</w:t>
             </w:r>
           </w:p>
         </w:tc>
@@ -5098,7 +5098,7 @@
                 <w:color w:val="000000"/>
                 <w:sz w:val="26"/>
               </w:rPr>
-              <w:t>07/09/2026 18:54:06</w:t>
+              <w:t>14/09/2026 19:20:41</w:t>
             </w:r>
           </w:p>
         </w:tc>
@@ -5189,7 +5189,7 @@
                 <w:color w:val="000000"/>
                 <w:sz w:val="26"/>
               </w:rPr>
-              <w:t>07/09/2026 18:54:09</w:t>
+              <w:t>14/09/2026 19:20:44</w:t>
             </w:r>
           </w:p>
         </w:tc>
@@ -5280,7 +5280,7 @@
                 <w:color w:val="000000"/>
                 <w:sz w:val="26"/>
               </w:rPr>
-              <w:t>07/09/2026 18:54:09</w:t>
+              <w:t>14/09/2026 19:20:44</w:t>
             </w:r>
           </w:p>
         </w:tc>
@@ -5371,7 +5371,7 @@
                 <w:color w:val="000000"/>
                 <w:sz w:val="26"/>
               </w:rPr>
-              <w:t>07/09/2026 18:54:15</w:t>
+              <w:t>14/09/2026 19:20:50</w:t>
             </w:r>
           </w:p>
         </w:tc>

</xml_diff>